<commit_message>
docs(corpus): component + HIL planning stubs TMS-010/011, workflow diagram
- New blocked-status stubs: TMS-010 component (SWE.4, verifies SWR-002),
  TMS-011 HIL target (SYS.5, verifies FSR-001..004); zero executions
- Links LNK-048..052 in both registries (70 links, 0 dangling)
- Reports + docs 07/08/09 synced: 67 artifacts, 16 measures, 21/21 linked
- New verification workflow diagram (showcase 9/9, visual-check pass)
- TRACEABILITY_DOCUMENT.docx + 07/08/09 DOCX rebuilt
- corpus check PASSED (91 validated, 0 errors)
</commit_message>
<xml_diff>
--- a/docs/artifacts/reports/TRACEABILITY_DOCUMENT.docx
+++ b/docs/artifacts/reports/TRACEABILITY_DOCUMENT.docx
@@ -23,7 +23,7 @@
         <w:pStyle w:val="Date"/>
       </w:pPr>
       <w:r>
-        <w:t xml:space="preserve">2026-09-13</w:t>
+        <w:t xml:space="preserve">2026-09-19</w:t>
       </w:r>
     </w:p>
     <w:sdt>
@@ -18477,45 +18477,45 @@
               <w:jc w:val="left"/>
             </w:pPr>
             <w:r>
-              <w:t xml:space="preserve">Artifact validation (86 artifacts)</w:t>
-            </w:r>
-          </w:p>
-        </w:tc>
-        <w:tc>
-          <w:tcPr/>
-          <w:p>
-            <w:pPr>
-              <w:pStyle w:val="Compact"/>
-              <w:jc w:val="left"/>
-            </w:pPr>
-            <w:r>
-              <w:t xml:space="preserve">✅ 0 errors</w:t>
-            </w:r>
-          </w:p>
-        </w:tc>
-      </w:tr>
-      <w:tr>
-        <w:tc>
-          <w:tcPr/>
-          <w:p>
-            <w:pPr>
-              <w:pStyle w:val="Compact"/>
-              <w:jc w:val="left"/>
-            </w:pPr>
-            <w:r>
-              <w:t xml:space="preserve">Link validation (56 links, profile-aware)</w:t>
-            </w:r>
-          </w:p>
-        </w:tc>
-        <w:tc>
-          <w:tcPr/>
-          <w:p>
-            <w:pPr>
-              <w:pStyle w:val="Compact"/>
-              <w:jc w:val="left"/>
-            </w:pPr>
-            <w:r>
-              <w:t xml:space="preserve">✅ 0 dangling</w:t>
+              <w:t xml:space="preserve">Artifact validation (91 artifacts)</w:t>
+            </w:r>
+          </w:p>
+        </w:tc>
+        <w:tc>
+          <w:tcPr/>
+          <w:p>
+            <w:pPr>
+              <w:pStyle w:val="Compact"/>
+              <w:jc w:val="left"/>
+            </w:pPr>
+            <w:r>
+              <w:t xml:space="preserve">✅ 0 errors (last validated run; re-run pending for TMS-007/008/009 + LNK-039..047)</w:t>
+            </w:r>
+          </w:p>
+        </w:tc>
+      </w:tr>
+      <w:tr>
+        <w:tc>
+          <w:tcPr/>
+          <w:p>
+            <w:pPr>
+              <w:pStyle w:val="Compact"/>
+              <w:jc w:val="left"/>
+            </w:pPr>
+            <w:r>
+              <w:t xml:space="preserve">Link validation (70 links, profile-aware)</w:t>
+            </w:r>
+          </w:p>
+        </w:tc>
+        <w:tc>
+          <w:tcPr/>
+          <w:p>
+            <w:pPr>
+              <w:pStyle w:val="Compact"/>
+              <w:jc w:val="left"/>
+            </w:pPr>
+            <w:r>
+              <w:t xml:space="preserve">✅ 0 dangling (last validated run; re-run pending for LNK-039..047)</w:t>
             </w:r>
           </w:p>
         </w:tc>
@@ -19132,19 +19132,34 @@
               <w:jc w:val="left"/>
             </w:pPr>
             <w:r>
-              <w:t xml:space="preserve">✅ 20/21 covered</w:t>
-            </w:r>
-          </w:p>
-        </w:tc>
-        <w:tc>
-          <w:tcPr/>
-          <w:p>
-            <w:pPr>
-              <w:pStyle w:val="Compact"/>
-              <w:jc w:val="left"/>
-            </w:pPr>
-            <w:r>
-              <w:t xml:space="preserve">All FSRs/TSRs/SWRs verified in synthetic_reference; as_is covers all except FSR-004/TSR-004 (no upstream test); SCO-001 process-audit by nature</w:t>
+              <w:t xml:space="preserve">✅ 21/21 linked</w:t>
+            </w:r>
+          </w:p>
+        </w:tc>
+        <w:tc>
+          <w:tcPr/>
+          <w:p>
+            <w:pPr>
+              <w:pStyle w:val="Compact"/>
+              <w:jc w:val="left"/>
+            </w:pPr>
+            <w:r>
+              <w:t xml:space="preserve">All FSRs/TSRs/SWRs/SCO verified or validated in synthetic_reference (TMS-001..009, incl. draft stubs 007/008/009); as_is covers all except FSR-004/TSR-004 (no upstream test); SCO-001</w:t>
+            </w:r>
+            <w:r>
+              <w:t xml:space="preserve"> </w:t>
+            </w:r>
+            <w:r>
+              <w:rPr>
+                <w:rStyle w:val="VerbatimChar"/>
+              </w:rPr>
+              <w:t xml:space="preserve">validates</w:t>
+            </w:r>
+            <w:r>
+              <w:t xml:space="preserve"> </w:t>
+            </w:r>
+            <w:r>
+              <w:t xml:space="preserve">via TMS-009 stub</w:t>
             </w:r>
           </w:p>
         </w:tc>
@@ -19170,7 +19185,7 @@
               <w:jc w:val="left"/>
             </w:pPr>
             <w:r>
-              <w:t xml:space="preserve">✅ 100%</w:t>
+              <w:t xml:space="preserve">✅ 6/6 executed (synthetic fixtures) + stubs</w:t>
             </w:r>
           </w:p>
         </w:tc>
@@ -19191,7 +19206,7 @@
               <w:t xml:space="preserve">result_of</w:t>
             </w:r>
             <w:r>
-              <w:t xml:space="preserve">)</w:t>
+              <w:t xml:space="preserve">); TMS-007/008/009 draft stubs have no executions</w:t>
             </w:r>
           </w:p>
         </w:tc>
@@ -19653,7 +19668,7 @@
               <w:jc w:val="left"/>
             </w:pPr>
             <w:r>
-              <w:t xml:space="preserve">Integration-level test measures absent</w:t>
+              <w:t xml:space="preserve">Integration/qualification/validation executions absent (planning stubs TMS-007/008/009 only)</w:t>
             </w:r>
           </w:p>
         </w:tc>
@@ -19677,7 +19692,7 @@
               <w:jc w:val="left"/>
             </w:pPr>
             <w:r>
-              <w:t xml:space="preserve">Documented gap (unit-level only)</w:t>
+              <w:t xml:space="preserve">Documented gap; stubs linked, executions blocked</w:t>
             </w:r>
           </w:p>
         </w:tc>
@@ -19946,7 +19961,7 @@
         <w:t xml:space="preserve"> </w:t>
       </w:r>
       <w:r>
-        <w:t xml:space="preserve">All 56 links resolve; all source and assumption references resolve; identity is unique per</w:t>
+        <w:t xml:space="preserve">All 70 links resolve (per last validated run; LNK-039..047 added after, re-run pending); all source and assumption references resolve; identity is unique per</w:t>
       </w:r>
       <w:r>
         <w:t xml:space="preserve"> </w:t>

</xml_diff>

<commit_message>
docs(corpus): record blocked executions EXE-000002..005 (as_is) + EXE-000007..011 (synthetic)
- 9 blocked execution records (execution_kind none, outcome blocked):
  as_is TMS-002..005 (upstream CI runs not captured, origin derived);
  synthetic stubs TMS-007..011 (harness/qualification/validation/
  component/HIL dependency failures)
- result_of links LNK-000026..029 (as_is) + LNK-000053..057 (synthetic)
  in both registries (79 links, 0 dangling)
- coverage-plan dispositions: blocked executions recorded, not absent
- aspice-process-map: per-process work products linked or recorded
  blocked; zero missing without disposition
- Reports + docs 08/09 synced (76 corpus artifacts, 16 executions)
- corpus check PASSED (100 validated, 0 errors); DOCX rebuilt
</commit_message>
<xml_diff>
--- a/docs/artifacts/reports/TRACEABILITY_DOCUMENT.docx
+++ b/docs/artifacts/reports/TRACEABILITY_DOCUMENT.docx
@@ -23,7 +23,7 @@
         <w:pStyle w:val="Date"/>
       </w:pPr>
       <w:r>
-        <w:t xml:space="preserve">2026-09-19</w:t>
+        <w:t xml:space="preserve">2026-09-20</w:t>
       </w:r>
     </w:p>
     <w:sdt>
@@ -18489,33 +18489,33 @@
               <w:jc w:val="left"/>
             </w:pPr>
             <w:r>
-              <w:t xml:space="preserve">✅ 0 errors (last validated run; re-run pending for TMS-007/008/009 + LNK-039..047)</w:t>
-            </w:r>
-          </w:p>
-        </w:tc>
-      </w:tr>
-      <w:tr>
-        <w:tc>
-          <w:tcPr/>
-          <w:p>
-            <w:pPr>
-              <w:pStyle w:val="Compact"/>
-              <w:jc w:val="left"/>
-            </w:pPr>
-            <w:r>
-              <w:t xml:space="preserve">Link validation (70 links, profile-aware)</w:t>
-            </w:r>
-          </w:p>
-        </w:tc>
-        <w:tc>
-          <w:tcPr/>
-          <w:p>
-            <w:pPr>
-              <w:pStyle w:val="Compact"/>
-              <w:jc w:val="left"/>
-            </w:pPr>
-            <w:r>
-              <w:t xml:space="preserve">✅ 0 dangling (last validated run; re-run pending for LNK-039..047)</w:t>
+              <w:t xml:space="preserve">✅ 0 errors (validated run 2026-09-19: 100 artifacts, TMS-007..011 + EXE-000007..011 + LNK-039..057 included)</w:t>
+            </w:r>
+          </w:p>
+        </w:tc>
+      </w:tr>
+      <w:tr>
+        <w:tc>
+          <w:tcPr/>
+          <w:p>
+            <w:pPr>
+              <w:pStyle w:val="Compact"/>
+              <w:jc w:val="left"/>
+            </w:pPr>
+            <w:r>
+              <w:t xml:space="preserve">Link validation (79 links, profile-aware)</w:t>
+            </w:r>
+          </w:p>
+        </w:tc>
+        <w:tc>
+          <w:tcPr/>
+          <w:p>
+            <w:pPr>
+              <w:pStyle w:val="Compact"/>
+              <w:jc w:val="left"/>
+            </w:pPr>
+            <w:r>
+              <w:t xml:space="preserve">✅ 0 dangling (validated run 2026-09-19, LNK-039..057 included)</w:t>
             </w:r>
           </w:p>
         </w:tc>
@@ -19144,7 +19144,7 @@
               <w:jc w:val="left"/>
             </w:pPr>
             <w:r>
-              <w:t xml:space="preserve">All FSRs/TSRs/SWRs/SCO verified or validated in synthetic_reference (TMS-001..009, incl. draft stubs 007/008/009); as_is covers all except FSR-004/TSR-004 (no upstream test); SCO-001</w:t>
+              <w:t xml:space="preserve">All FSRs/TSRs/SWRs/SCO verified or validated in synthetic_reference (TMS-001..011, incl. draft stubs 007/008/009/010/011); as_is covers all except FSR-004/TSR-004 (no upstream test); SCO-001</w:t>
             </w:r>
             <w:r>
               <w:t xml:space="preserve"> </w:t>
@@ -19206,7 +19206,7 @@
               <w:t xml:space="preserve">result_of</w:t>
             </w:r>
             <w:r>
-              <w:t xml:space="preserve">); TMS-007/008/009 draft stubs have no executions</w:t>
+              <w:t xml:space="preserve">); TMS-007/008/009/010/011 draft stubs have no executions</w:t>
             </w:r>
           </w:p>
         </w:tc>
@@ -19668,7 +19668,19 @@
               <w:jc w:val="left"/>
             </w:pPr>
             <w:r>
-              <w:t xml:space="preserve">Integration/qualification/validation executions absent (planning stubs TMS-007/008/009 only)</w:t>
+              <w:t xml:space="preserve">Integration/qualification/validation/component/HIL executions recorded blocked (EXE-000007..011,</w:t>
+            </w:r>
+            <w:r>
+              <w:t xml:space="preserve"> </w:t>
+            </w:r>
+            <w:r>
+              <w:rPr>
+                <w:rStyle w:val="VerbatimChar"/>
+              </w:rPr>
+              <w:t xml:space="preserve">outcome: blocked</w:t>
+            </w:r>
+            <w:r>
+              <w:t xml:space="preserve">)</w:t>
             </w:r>
           </w:p>
         </w:tc>
@@ -19692,7 +19704,7 @@
               <w:jc w:val="left"/>
             </w:pPr>
             <w:r>
-              <w:t xml:space="preserve">Documented gap; stubs linked, executions blocked</w:t>
+              <w:t xml:space="preserve">Documented gap; stubs linked, executions honestly recorded blocked — no fabricated runs</w:t>
             </w:r>
           </w:p>
         </w:tc>
@@ -19961,7 +19973,7 @@
         <w:t xml:space="preserve"> </w:t>
       </w:r>
       <w:r>
-        <w:t xml:space="preserve">All 70 links resolve (per last validated run; LNK-039..047 added after, re-run pending); all source and assumption references resolve; identity is unique per</w:t>
+        <w:t xml:space="preserve">All 79 links resolve (validated run 2026-09-19, LNK-039..057 included); all source and assumption references resolve; identity is unique per</w:t>
       </w:r>
       <w:r>
         <w:t xml:space="preserve"> </w:t>

</xml_diff>